<commit_message>
Add professional photo to hero; refresh downloadable resume
Hero now opens with the profile photo in a gradient ring. The resume
docx served by the Download button gets the new photo, Technical
Consultant designation, current date, and new bullets covering the
five Copilot Studio agents and the 11 technical blogs.

Co-Authored-By: Claude Fable 5 <noreply@anthropic.com>
</commit_message>
<xml_diff>
--- a/public/Shrey-Chauhan-Resume.docx
+++ b/public/Shrey-Chauhan-Resume.docx
@@ -154,7 +154,7 @@
                 <w:spacing w:val="0"/>
                 <w:w w:val="100"/>
               </w:rPr>
-              <w:t>Associate Technical Consultant</w:t>
+              <w:t>Technical Consultant</w:t>
             </w:r>
           </w:p>
         </w:tc>
@@ -1158,7 +1158,7 @@
                 <w:szCs w:val="20"/>
               </w:rPr>
               <w:br/>
-              <w:t>Associate Technical Consultant</w:t>
+              <w:t>Technical Consultant</w:t>
             </w:r>
             <w:r>
               <w:rPr>
@@ -1194,7 +1194,7 @@
                 <w:sz w:val="20"/>
                 <w:szCs w:val="20"/>
               </w:rPr>
-              <w:t>Current (July 2025)</w:t>
+              <w:t>Current (July 2026)</w:t>
             </w:r>
           </w:p>
           <w:p>
@@ -1351,6 +1351,30 @@
             </w:pPr>
             <w:r>
               <w:t>Also Developed Independent Modules (EXIM Module, MSME Module and E-Way Bill Module)</w:t>
+            </w:r>
+          </w:p>
+          <w:p>
+            <w:pPr>
+              <w:pStyle w:val="ListParagraph"/>
+              <w:numPr>
+                <w:ilvl w:val="0"/>
+                <w:numId w:val="12"/>
+              </w:numPr>
+            </w:pPr>
+            <w:r>
+              <w:t>Built an AI Agent Portfolio of 5 Microsoft Copilot Studio agents for Business Central covering production planning, finance &amp; compliance, customer intelligence, inventory and manufacturing operations, using custom AL API pages with human-in-the-loop design.</w:t>
+            </w:r>
+          </w:p>
+          <w:p>
+            <w:pPr>
+              <w:pStyle w:val="ListParagraph"/>
+              <w:numPr>
+                <w:ilvl w:val="0"/>
+                <w:numId w:val="12"/>
+              </w:numPr>
+            </w:pPr>
+            <w:r>
+              <w:t>Authored 11 technical blogs on AL development (custom APIs, RecordRef &amp; FieldRef, Job Queue automation, C/AL to AL migration). Portfolio: https://shreychauhan29.github.io/Portfolio/</w:t>
             </w:r>
           </w:p>
           <w:p/>

</xml_diff>

<commit_message>
MB-820 certified: update portfolio, folio, CV, résumé + host credential
MB-820 changed from in-progress to Microsoft Certified (Dynamics 365
Business Central Developer Associate, earned Sep 2026) across the
interactive site, folio.html, and cv.html — with a View credential link.
Certificate PDF hosted at public/MB-820-Certificate.pdf. Résumé docx/PDF
updated with the certification and re-exported.

Co-Authored-By: Claude Fable 5 <noreply@anthropic.com>
</commit_message>
<xml_diff>
--- a/public/Shrey-Chauhan-Resume.docx
+++ b/public/Shrey-Chauhan-Resume.docx
@@ -1636,6 +1636,32 @@
                 <w:szCs w:val="22"/>
               </w:rPr>
               <w:t>Certifications</w:t>
+            </w:r>
+          </w:p>
+          <w:p>
+            <w:pPr>
+              <w:numPr>
+                <w:ilvl w:val="0"/>
+                <w:numId w:val="3"/>
+              </w:numPr>
+              <w:jc w:val="both"/>
+              <w:rPr>
+                <w:b/>
+                <w:iCs/>
+                <w:snapToGrid w:val="0"/>
+                <w:sz w:val="20"/>
+                <w:szCs w:val="20"/>
+              </w:rPr>
+            </w:pPr>
+            <w:r>
+              <w:rPr>
+                <w:b/>
+                <w:iCs/>
+                <w:snapToGrid w:val="0"/>
+                <w:sz w:val="20"/>
+                <w:szCs w:val="20"/>
+              </w:rPr>
+              <w:t xml:space="preserve">MB-820: Microsoft Certified – Dynamics 365 Business Central Developer Associate (Sep 2026)</w:t>
             </w:r>
           </w:p>
           <w:p>

</xml_diff>

<commit_message>
Add OCR Invoice Capture: blog + project across all portfolios
New blog (13th) generated from the OCR solution doc with 18 figures and
TOC. Added OCR Invoice Capture as a featured project on the interactive
site, folio, and CV. Bumped blog count 12 -> 13 in stats, experience,
folio, CV, and résumé (which also gains the OCR module in its modules line).

Co-Authored-By: Claude Fable 5 <noreply@anthropic.com>
</commit_message>
<xml_diff>
--- a/public/Shrey-Chauhan-Resume.docx
+++ b/public/Shrey-Chauhan-Resume.docx
@@ -1350,7 +1350,7 @@
               </w:numPr>
             </w:pPr>
             <w:r>
-              <w:t>Also Developed Independent Modules (EXIM Module, MSME Module and E-Way Bill Module)</w:t>
+              <w:t>Also Developed Independent Modules (EXIM Module, MSME Module, E-Way Bill Module and an AI-powered OCR Invoice Capture module)</w:t>
             </w:r>
           </w:p>
           <w:p>
@@ -1374,7 +1374,7 @@
               </w:numPr>
             </w:pPr>
             <w:r>
-              <w:t>Authored 12 technical blogs on AL development (custom APIs, RecordRef &amp; FieldRef, Job Queue automation, C/AL to AL migration). Portfolio: https://shreychauhan29.github.io/Portfolio/</w:t>
+              <w:t>Authored 13 technical blogs on AL development (custom APIs, RecordRef &amp; FieldRef, Job Queue automation, C/AL to AL migration). Portfolio: https://shreychauhan29.github.io/Portfolio/</w:t>
             </w:r>
           </w:p>
           <w:p/>

</xml_diff>